<commit_message>
Nassar: Upgraded to EfficientNet-B7, added scSE attention, Mish activation, and MLP RegressionHead
</commit_message>
<xml_diff>
--- a/Tasks - Deep Learning.docx
+++ b/Tasks - Deep Learning.docx
@@ -387,6 +387,9 @@
     </w:p>
     <w:p>
       <w:r>
+        <w:t xml:space="preserve"> </w:t>
+      </w:r>
+      <w:r>
         <w:t>The baseline uses efficientnet-b4. It’s insufficient for high-fidelity medical segmentation.</w:t>
       </w:r>
     </w:p>
@@ -1017,7 +1020,16 @@
         <w:br/>
       </w:r>
     </w:p>
-    <w:p/>
+    <w:p>
+      <w:pPr>
+        <w:tabs>
+          <w:tab w:val="left" w:pos="3345"/>
+        </w:tabs>
+      </w:pPr>
+      <w:r>
+        <w:tab/>
+      </w:r>
+    </w:p>
     <w:p/>
     <w:p/>
     <w:p/>
@@ -6892,6 +6904,7 @@
   <w:style w:type="character" w:default="1" w:styleId="DefaultParagraphFont">
     <w:name w:val="Default Paragraph Font"/>
     <w:uiPriority w:val="1"/>
+    <w:semiHidden/>
     <w:unhideWhenUsed/>
   </w:style>
   <w:style w:type="table" w:default="1" w:styleId="TableNormal">

</xml_diff>